<commit_message>
update my cv project file to add git table cpmmands
</commit_message>
<xml_diff>
--- a/my cv project.docx
+++ b/my cv project.docx
@@ -846,7 +846,25 @@
           <w:bCs/>
           <w:sz w:val="22"/>
         </w:rPr>
-        <w:t xml:space="preserve"> (IaC):</w:t>
+        <w:t xml:space="preserve"> (</w:t>
+      </w:r>
+      <w:proofErr w:type="spellStart"/>
+      <w:r>
+        <w:rPr>
+          <w:b/>
+          <w:bCs/>
+          <w:sz w:val="22"/>
+        </w:rPr>
+        <w:t>IaC</w:t>
+      </w:r>
+      <w:proofErr w:type="spellEnd"/>
+      <w:r>
+        <w:rPr>
+          <w:b/>
+          <w:bCs/>
+          <w:sz w:val="22"/>
+        </w:rPr>
+        <w:t>):</w:t>
       </w:r>
       <w:r>
         <w:rPr>
@@ -1064,12 +1082,21 @@
         </w:rPr>
         <w:t xml:space="preserve">at </w:t>
       </w:r>
-      <w:r>
-        <w:rPr>
-          <w:color w:val="auto"/>
-          <w:sz w:val="22"/>
-        </w:rPr>
-        <w:t xml:space="preserve">Leep NGO, Penrith NSW  </w:t>
+      <w:proofErr w:type="spellStart"/>
+      <w:r>
+        <w:rPr>
+          <w:color w:val="auto"/>
+          <w:sz w:val="22"/>
+        </w:rPr>
+        <w:t>Leep</w:t>
+      </w:r>
+      <w:proofErr w:type="spellEnd"/>
+      <w:r>
+        <w:rPr>
+          <w:color w:val="auto"/>
+          <w:sz w:val="22"/>
+        </w:rPr>
+        <w:t xml:space="preserve"> NGO, Penrith NSW  </w:t>
       </w:r>
     </w:p>
     <w:p>
@@ -1164,15 +1191,22 @@
         </w:rPr>
         <w:t xml:space="preserve"> in </w:t>
       </w:r>
+      <w:proofErr w:type="spellStart"/>
       <w:r>
         <w:rPr>
           <w:b/>
         </w:rPr>
         <w:t>expereience</w:t>
       </w:r>
-      <w:r>
-        <w:t xml:space="preserve"> ( add</w:t>
-      </w:r>
+      <w:proofErr w:type="spellEnd"/>
+      <w:r>
+        <w:t xml:space="preserve"> </w:t>
+      </w:r>
+      <w:proofErr w:type="gramStart"/>
+      <w:r>
+        <w:t>( add</w:t>
+      </w:r>
+      <w:proofErr w:type="gramEnd"/>
       <w:r>
         <w:t xml:space="preserve"> as much as you can)</w:t>
       </w:r>
@@ -1415,7 +1449,6 @@
         <w:rPr>
           <w:sz w:val="22"/>
         </w:rPr>
-        <w:lastRenderedPageBreak/>
         <w:tab/>
         <w:t xml:space="preserve">• Improved the release efficiency by 20% by introducing the CI/CD best practices such as </w:t>
       </w:r>
@@ -1760,7 +1793,21 @@
         <w:rPr>
           <w:lang w:val="en-US"/>
         </w:rPr>
-        <w:t xml:space="preserve">Jenkins, Git, Maven, JFrog, Ansible. </w:t>
+        <w:t xml:space="preserve">Jenkins, Git, Maven, </w:t>
+      </w:r>
+      <w:proofErr w:type="spellStart"/>
+      <w:r>
+        <w:rPr>
+          <w:lang w:val="en-US"/>
+        </w:rPr>
+        <w:t>JFrog</w:t>
+      </w:r>
+      <w:proofErr w:type="spellEnd"/>
+      <w:r>
+        <w:rPr>
+          <w:lang w:val="en-US"/>
+        </w:rPr>
+        <w:t xml:space="preserve">, Ansible. </w:t>
       </w:r>
     </w:p>
     <w:p>
@@ -1883,6 +1930,7 @@
         <w:rPr>
           <w:b/>
         </w:rPr>
+        <w:lastRenderedPageBreak/>
         <w:t xml:space="preserve">Professional </w:t>
       </w:r>
       <w:r>
@@ -1960,12 +2008,21 @@
           <w:sz w:val="22"/>
         </w:rPr>
       </w:pPr>
-      <w:r>
-        <w:rPr>
-          <w:color w:val="auto"/>
-          <w:sz w:val="22"/>
-        </w:rPr>
-        <w:t>Datalynx, Sydney</w:t>
+      <w:proofErr w:type="spellStart"/>
+      <w:r>
+        <w:rPr>
+          <w:color w:val="auto"/>
+          <w:sz w:val="22"/>
+        </w:rPr>
+        <w:t>Datalynx</w:t>
+      </w:r>
+      <w:proofErr w:type="spellEnd"/>
+      <w:r>
+        <w:rPr>
+          <w:color w:val="auto"/>
+          <w:sz w:val="22"/>
+        </w:rPr>
+        <w:t>, Sydney</w:t>
       </w:r>
       <w:r>
         <w:rPr>
@@ -2017,6 +2074,7 @@
         </w:rPr>
       </w:pPr>
       <w:hyperlink r:id="rId12" w:history="1">
+        <w:proofErr w:type="spellStart"/>
         <w:r>
           <w:rPr>
             <w:rStyle w:val="Hyperlink"/>
@@ -2026,6 +2084,7 @@
           </w:rPr>
           <w:t>Datalynx</w:t>
         </w:r>
+        <w:proofErr w:type="spellEnd"/>
       </w:hyperlink>
       <w:r>
         <w:rPr>
@@ -2252,7 +2311,6 @@
           <w:color w:val="auto"/>
           <w:sz w:val="22"/>
         </w:rPr>
-        <w:lastRenderedPageBreak/>
         <w:t>Streamlined ETL Processes</w:t>
       </w:r>
       <w:r>
@@ -3372,7 +3430,26 @@
           <w:color w:val="auto"/>
           <w:sz w:val="22"/>
         </w:rPr>
-        <w:t>Al-Zaytoonah Private University of Jordan, Amman-Jordan, 2009</w:t>
+        <w:lastRenderedPageBreak/>
+        <w:t>Al-</w:t>
+      </w:r>
+      <w:proofErr w:type="spellStart"/>
+      <w:r>
+        <w:rPr>
+          <w:rFonts w:asciiTheme="minorHAnsi" w:hAnsiTheme="minorHAnsi" w:cstheme="minorHAnsi"/>
+          <w:color w:val="auto"/>
+          <w:sz w:val="22"/>
+        </w:rPr>
+        <w:t>Zaytoonah</w:t>
+      </w:r>
+      <w:proofErr w:type="spellEnd"/>
+      <w:r>
+        <w:rPr>
+          <w:rFonts w:asciiTheme="minorHAnsi" w:hAnsiTheme="minorHAnsi" w:cstheme="minorHAnsi"/>
+          <w:color w:val="auto"/>
+          <w:sz w:val="22"/>
+        </w:rPr>
+        <w:t xml:space="preserve"> Private University of Jordan, Amman-Jordan, 2009</w:t>
       </w:r>
     </w:p>
     <w:p>
@@ -3454,11 +3531,47 @@
           <w:b/>
         </w:rPr>
       </w:pPr>
-      <w:r>
-        <w:rPr>
-          <w:b/>
-        </w:rPr>
-        <w:t xml:space="preserve">Certificate , course in udemy, course in youtube, </w:t>
+      <w:proofErr w:type="gramStart"/>
+      <w:r>
+        <w:rPr>
+          <w:b/>
+        </w:rPr>
+        <w:t>Certificate ,</w:t>
+      </w:r>
+      <w:proofErr w:type="gramEnd"/>
+      <w:r>
+        <w:rPr>
+          <w:b/>
+        </w:rPr>
+        <w:t xml:space="preserve"> course in </w:t>
+      </w:r>
+      <w:proofErr w:type="spellStart"/>
+      <w:r>
+        <w:rPr>
+          <w:b/>
+        </w:rPr>
+        <w:t>udemy</w:t>
+      </w:r>
+      <w:proofErr w:type="spellEnd"/>
+      <w:r>
+        <w:rPr>
+          <w:b/>
+        </w:rPr>
+        <w:t xml:space="preserve">, course in </w:t>
+      </w:r>
+      <w:proofErr w:type="spellStart"/>
+      <w:r>
+        <w:rPr>
+          <w:b/>
+        </w:rPr>
+        <w:t>youtube</w:t>
+      </w:r>
+      <w:proofErr w:type="spellEnd"/>
+      <w:r>
+        <w:rPr>
+          <w:b/>
+        </w:rPr>
+        <w:t xml:space="preserve">, </w:t>
       </w:r>
       <w:r>
         <w:rPr>
@@ -4249,13 +4362,907 @@
         <w:t>Available upon request</w:t>
       </w:r>
     </w:p>
+    <w:p>
+      <w:pPr>
+        <w:spacing w:after="102"/>
+        <w:ind w:right="2"/>
+        <w:rPr>
+          <w:bCs/>
+          <w:sz w:val="22"/>
+        </w:rPr>
+      </w:pPr>
+    </w:p>
+    <w:p>
+      <w:pPr>
+        <w:spacing w:after="102"/>
+        <w:ind w:right="2"/>
+        <w:rPr>
+          <w:bCs/>
+          <w:sz w:val="22"/>
+        </w:rPr>
+      </w:pPr>
+    </w:p>
+    <w:p>
+      <w:pPr>
+        <w:spacing w:after="102"/>
+        <w:ind w:right="2"/>
+        <w:rPr>
+          <w:bCs/>
+          <w:sz w:val="22"/>
+        </w:rPr>
+      </w:pPr>
+    </w:p>
+    <w:p>
+      <w:pPr>
+        <w:spacing w:after="102"/>
+        <w:ind w:right="2"/>
+        <w:rPr>
+          <w:bCs/>
+          <w:sz w:val="22"/>
+        </w:rPr>
+      </w:pPr>
+    </w:p>
+    <w:p>
+      <w:pPr>
+        <w:spacing w:after="102"/>
+        <w:ind w:right="2"/>
+        <w:rPr>
+          <w:bCs/>
+          <w:sz w:val="22"/>
+        </w:rPr>
+      </w:pPr>
+    </w:p>
+    <w:p>
+      <w:pPr>
+        <w:spacing w:after="102"/>
+        <w:ind w:right="2"/>
+        <w:rPr>
+          <w:bCs/>
+          <w:sz w:val="22"/>
+        </w:rPr>
+      </w:pPr>
+    </w:p>
+    <w:p>
+      <w:pPr>
+        <w:spacing w:after="102"/>
+        <w:ind w:right="2"/>
+        <w:rPr>
+          <w:bCs/>
+          <w:sz w:val="22"/>
+        </w:rPr>
+      </w:pPr>
+    </w:p>
+    <w:p>
+      <w:pPr>
+        <w:spacing w:after="102"/>
+        <w:ind w:right="2"/>
+        <w:rPr>
+          <w:bCs/>
+          <w:sz w:val="22"/>
+        </w:rPr>
+      </w:pPr>
+    </w:p>
+    <w:p>
+      <w:pPr>
+        <w:spacing w:after="102"/>
+        <w:ind w:right="2"/>
+        <w:rPr>
+          <w:bCs/>
+          <w:sz w:val="22"/>
+        </w:rPr>
+      </w:pPr>
+    </w:p>
+    <w:p>
+      <w:pPr>
+        <w:spacing w:after="102"/>
+        <w:ind w:right="2"/>
+        <w:rPr>
+          <w:bCs/>
+          <w:sz w:val="22"/>
+        </w:rPr>
+      </w:pPr>
+    </w:p>
+    <w:p>
+      <w:pPr>
+        <w:spacing w:after="102"/>
+        <w:ind w:right="2"/>
+        <w:rPr>
+          <w:rFonts w:ascii="Consolas" w:eastAsia="Times New Roman" w:hAnsi="Consolas" w:cs="Courier New"/>
+          <w:i/>
+          <w:iCs/>
+          <w:color w:val="1F2328"/>
+          <w:kern w:val="0"/>
+          <w:sz w:val="20"/>
+          <w:szCs w:val="20"/>
+          <w:lang w:val="en-AU" w:eastAsia="en-AU"/>
+          <w14:ligatures w14:val="none"/>
+        </w:rPr>
+      </w:pPr>
+      <w:r>
+        <w:rPr>
+          <w:rFonts w:ascii="Consolas" w:eastAsia="Times New Roman" w:hAnsi="Consolas" w:cs="Courier New"/>
+          <w:i/>
+          <w:iCs/>
+          <w:color w:val="1F2328"/>
+          <w:kern w:val="0"/>
+          <w:sz w:val="20"/>
+          <w:szCs w:val="20"/>
+          <w:lang w:val="en-AU" w:eastAsia="en-AU"/>
+          <w14:ligatures w14:val="none"/>
+        </w:rPr>
+        <w:t>git init</w:t>
+      </w:r>
+    </w:p>
+    <w:p>
+      <w:pPr>
+        <w:spacing w:after="102"/>
+        <w:ind w:right="2"/>
+        <w:rPr>
+          <w:rFonts w:ascii="Consolas" w:eastAsia="Times New Roman" w:hAnsi="Consolas" w:cs="Courier New"/>
+          <w:i/>
+          <w:iCs/>
+          <w:color w:val="1F2328"/>
+          <w:kern w:val="0"/>
+          <w:sz w:val="20"/>
+          <w:szCs w:val="20"/>
+          <w:lang w:val="en-AU" w:eastAsia="en-AU"/>
+          <w14:ligatures w14:val="none"/>
+        </w:rPr>
+      </w:pPr>
+      <w:r>
+        <w:rPr>
+          <w:rFonts w:ascii="Consolas" w:eastAsia="Times New Roman" w:hAnsi="Consolas" w:cs="Courier New"/>
+          <w:i/>
+          <w:iCs/>
+          <w:color w:val="1F2328"/>
+          <w:kern w:val="0"/>
+          <w:sz w:val="20"/>
+          <w:szCs w:val="20"/>
+          <w:lang w:val="en-AU" w:eastAsia="en-AU"/>
+          <w14:ligatures w14:val="none"/>
+        </w:rPr>
+        <w:t>git status</w:t>
+      </w:r>
+    </w:p>
+    <w:p>
+      <w:pPr>
+        <w:spacing w:after="102"/>
+        <w:ind w:right="2"/>
+        <w:rPr>
+          <w:rFonts w:ascii="Consolas" w:eastAsia="Times New Roman" w:hAnsi="Consolas" w:cs="Courier New"/>
+          <w:i/>
+          <w:iCs/>
+          <w:color w:val="1F2328"/>
+          <w:kern w:val="0"/>
+          <w:sz w:val="20"/>
+          <w:szCs w:val="20"/>
+          <w:lang w:val="en-AU" w:eastAsia="en-AU"/>
+          <w14:ligatures w14:val="none"/>
+        </w:rPr>
+      </w:pPr>
+    </w:p>
+    <w:tbl>
+      <w:tblPr>
+        <w:tblStyle w:val="TableGrid0"/>
+        <w:tblW w:w="0" w:type="auto"/>
+        <w:tblInd w:w="29" w:type="dxa"/>
+        <w:tblBorders>
+          <w:top w:val="none" w:sz="0" w:space="0" w:color="auto"/>
+          <w:left w:val="none" w:sz="0" w:space="0" w:color="auto"/>
+          <w:bottom w:val="none" w:sz="0" w:space="0" w:color="auto"/>
+          <w:right w:val="none" w:sz="0" w:space="0" w:color="auto"/>
+          <w:insideH w:val="none" w:sz="0" w:space="0" w:color="auto"/>
+          <w:insideV w:val="none" w:sz="0" w:space="0" w:color="auto"/>
+        </w:tblBorders>
+        <w:shd w:val="pct5" w:color="auto" w:fill="auto"/>
+        <w:tblLook w:val="05A0" w:firstRow="1" w:lastRow="0" w:firstColumn="1" w:lastColumn="1" w:noHBand="0" w:noVBand="1"/>
+      </w:tblPr>
+      <w:tblGrid>
+        <w:gridCol w:w="3227"/>
+        <w:gridCol w:w="3227"/>
+      </w:tblGrid>
+      <w:tr>
+        <w:tc>
+          <w:tcPr>
+            <w:tcW w:w="3227" w:type="dxa"/>
+            <w:shd w:val="pct5" w:color="auto" w:fill="auto"/>
+          </w:tcPr>
+          <w:p>
+            <w:pPr>
+              <w:spacing w:after="102"/>
+              <w:ind w:right="2"/>
+              <w:rPr>
+                <w:rFonts w:ascii="Consolas" w:eastAsia="Times New Roman" w:hAnsi="Consolas" w:cs="Courier New"/>
+                <w:i/>
+                <w:iCs/>
+                <w:color w:val="1F2328"/>
+                <w:kern w:val="0"/>
+                <w:sz w:val="20"/>
+                <w:szCs w:val="20"/>
+                <w:lang w:val="en-AU" w:eastAsia="en-AU"/>
+                <w14:ligatures w14:val="none"/>
+              </w:rPr>
+            </w:pPr>
+            <w:r>
+              <w:rPr>
+                <w:rFonts w:ascii="Consolas" w:eastAsia="Times New Roman" w:hAnsi="Consolas" w:cs="Courier New"/>
+                <w:i/>
+                <w:iCs/>
+                <w:color w:val="1F2328"/>
+                <w:kern w:val="0"/>
+                <w:sz w:val="20"/>
+                <w:szCs w:val="20"/>
+                <w:lang w:val="en-AU" w:eastAsia="en-AU"/>
+                <w14:ligatures w14:val="none"/>
+              </w:rPr>
+              <w:t>git init</w:t>
+            </w:r>
+          </w:p>
+          <w:p>
+            <w:pPr>
+              <w:spacing w:after="102"/>
+              <w:ind w:right="2"/>
+              <w:rPr>
+                <w:rFonts w:ascii="Consolas" w:eastAsia="Times New Roman" w:hAnsi="Consolas" w:cs="Courier New"/>
+                <w:i/>
+                <w:iCs/>
+                <w:color w:val="1F2328"/>
+                <w:kern w:val="0"/>
+                <w:sz w:val="20"/>
+                <w:szCs w:val="20"/>
+                <w:lang w:val="en-AU" w:eastAsia="en-AU"/>
+                <w14:ligatures w14:val="none"/>
+              </w:rPr>
+            </w:pPr>
+            <w:r>
+              <w:rPr>
+                <w:rFonts w:ascii="Consolas" w:eastAsia="Times New Roman" w:hAnsi="Consolas" w:cs="Courier New"/>
+                <w:i/>
+                <w:iCs/>
+                <w:color w:val="1F2328"/>
+                <w:kern w:val="0"/>
+                <w:sz w:val="20"/>
+                <w:szCs w:val="20"/>
+                <w:lang w:val="en-AU" w:eastAsia="en-AU"/>
+                <w14:ligatures w14:val="none"/>
+              </w:rPr>
+              <w:t>git status</w:t>
+            </w:r>
+          </w:p>
+          <w:p>
+            <w:pPr>
+              <w:spacing w:after="102"/>
+              <w:ind w:right="2"/>
+              <w:rPr>
+                <w:rFonts w:ascii="Consolas" w:eastAsia="Times New Roman" w:hAnsi="Consolas" w:cs="Courier New"/>
+                <w:i/>
+                <w:iCs/>
+                <w:color w:val="1F2328"/>
+                <w:kern w:val="0"/>
+                <w:sz w:val="20"/>
+                <w:szCs w:val="20"/>
+                <w:lang w:val="en-AU" w:eastAsia="en-AU"/>
+                <w14:ligatures w14:val="none"/>
+              </w:rPr>
+            </w:pPr>
+          </w:p>
+          <w:p>
+            <w:pPr>
+              <w:spacing w:after="102"/>
+              <w:ind w:right="2"/>
+              <w:rPr>
+                <w:rFonts w:ascii="Consolas" w:eastAsia="Times New Roman" w:hAnsi="Consolas" w:cs="Courier New"/>
+                <w:i/>
+                <w:iCs/>
+                <w:color w:val="1F2328"/>
+                <w:kern w:val="0"/>
+                <w:sz w:val="20"/>
+                <w:szCs w:val="20"/>
+                <w:lang w:val="en-AU" w:eastAsia="en-AU"/>
+                <w14:ligatures w14:val="none"/>
+              </w:rPr>
+            </w:pPr>
+          </w:p>
+        </w:tc>
+        <w:tc>
+          <w:tcPr>
+            <w:tcW w:w="3227" w:type="dxa"/>
+            <w:shd w:val="pct5" w:color="auto" w:fill="auto"/>
+          </w:tcPr>
+          <w:p>
+            <w:pPr>
+              <w:spacing w:after="102"/>
+              <w:ind w:right="2"/>
+              <w:rPr>
+                <w:rFonts w:ascii="Consolas" w:eastAsia="Times New Roman" w:hAnsi="Consolas" w:cs="Courier New"/>
+                <w:i/>
+                <w:iCs/>
+                <w:color w:val="1F2328"/>
+                <w:kern w:val="0"/>
+                <w:sz w:val="20"/>
+                <w:szCs w:val="20"/>
+                <w:lang w:val="en-AU" w:eastAsia="en-AU"/>
+                <w14:ligatures w14:val="none"/>
+              </w:rPr>
+            </w:pPr>
+          </w:p>
+        </w:tc>
+      </w:tr>
+    </w:tbl>
+    <w:p>
+      <w:pPr>
+        <w:spacing w:after="102"/>
+        <w:ind w:right="2"/>
+        <w:rPr>
+          <w:bCs/>
+          <w:sz w:val="22"/>
+        </w:rPr>
+      </w:pPr>
+    </w:p>
+    <w:p>
+      <w:pPr>
+        <w:spacing w:after="102"/>
+        <w:ind w:right="2"/>
+        <w:rPr>
+          <w:bCs/>
+          <w:sz w:val="22"/>
+        </w:rPr>
+      </w:pPr>
+    </w:p>
+    <w:p>
+      <w:pPr>
+        <w:spacing w:after="102"/>
+        <w:ind w:right="2"/>
+        <w:rPr>
+          <w:bCs/>
+          <w:sz w:val="22"/>
+        </w:rPr>
+      </w:pPr>
+    </w:p>
+    <w:p>
+      <w:pPr>
+        <w:spacing w:after="102"/>
+        <w:ind w:right="2"/>
+        <w:rPr>
+          <w:bCs/>
+          <w:sz w:val="22"/>
+        </w:rPr>
+      </w:pPr>
+    </w:p>
+    <w:p>
+      <w:pPr>
+        <w:spacing w:after="102"/>
+        <w:ind w:right="2"/>
+        <w:rPr>
+          <w:bCs/>
+          <w:sz w:val="22"/>
+        </w:rPr>
+      </w:pPr>
+    </w:p>
+    <w:p>
+      <w:pPr>
+        <w:spacing w:after="102"/>
+        <w:ind w:right="2"/>
+        <w:rPr>
+          <w:bCs/>
+          <w:sz w:val="22"/>
+        </w:rPr>
+      </w:pPr>
+    </w:p>
+    <w:p>
+      <w:pPr>
+        <w:spacing w:after="102"/>
+        <w:ind w:right="2"/>
+        <w:rPr>
+          <w:bCs/>
+          <w:sz w:val="22"/>
+        </w:rPr>
+      </w:pPr>
+    </w:p>
+    <w:p>
+      <w:pPr>
+        <w:spacing w:after="102"/>
+        <w:ind w:right="2"/>
+        <w:rPr>
+          <w:bCs/>
+          <w:sz w:val="22"/>
+        </w:rPr>
+      </w:pPr>
+    </w:p>
+    <w:p>
+      <w:pPr>
+        <w:spacing w:after="102"/>
+        <w:ind w:right="2"/>
+        <w:rPr>
+          <w:bCs/>
+          <w:sz w:val="22"/>
+        </w:rPr>
+      </w:pPr>
+    </w:p>
+    <w:p>
+      <w:pPr>
+        <w:spacing w:after="102"/>
+        <w:ind w:right="2"/>
+        <w:rPr>
+          <w:bCs/>
+          <w:sz w:val="22"/>
+        </w:rPr>
+      </w:pPr>
+    </w:p>
+    <w:p>
+      <w:pPr>
+        <w:spacing w:after="102"/>
+        <w:ind w:right="2"/>
+        <w:rPr>
+          <w:bCs/>
+          <w:sz w:val="22"/>
+        </w:rPr>
+      </w:pPr>
+    </w:p>
+    <w:p>
+      <w:pPr>
+        <w:spacing w:after="102"/>
+        <w:ind w:right="2"/>
+        <w:rPr>
+          <w:bCs/>
+          <w:sz w:val="22"/>
+        </w:rPr>
+      </w:pPr>
+    </w:p>
+    <w:p>
+      <w:pPr>
+        <w:spacing w:after="102"/>
+        <w:ind w:right="2"/>
+        <w:rPr>
+          <w:bCs/>
+          <w:sz w:val="22"/>
+        </w:rPr>
+      </w:pPr>
+    </w:p>
+    <w:p>
+      <w:pPr>
+        <w:spacing w:after="102"/>
+        <w:ind w:right="2"/>
+        <w:rPr>
+          <w:bCs/>
+          <w:sz w:val="22"/>
+        </w:rPr>
+      </w:pPr>
+    </w:p>
+    <w:p>
+      <w:pPr>
+        <w:spacing w:after="102"/>
+        <w:ind w:right="2"/>
+        <w:rPr>
+          <w:bCs/>
+          <w:sz w:val="22"/>
+        </w:rPr>
+      </w:pPr>
+    </w:p>
+    <w:p>
+      <w:pPr>
+        <w:spacing w:after="102"/>
+        <w:ind w:right="2"/>
+        <w:rPr>
+          <w:bCs/>
+          <w:sz w:val="22"/>
+        </w:rPr>
+      </w:pPr>
+    </w:p>
+    <w:p>
+      <w:pPr>
+        <w:spacing w:after="102"/>
+        <w:ind w:right="2"/>
+        <w:rPr>
+          <w:bCs/>
+          <w:sz w:val="22"/>
+        </w:rPr>
+      </w:pPr>
+    </w:p>
+    <w:p>
+      <w:pPr>
+        <w:spacing w:after="102"/>
+        <w:ind w:right="2"/>
+        <w:rPr>
+          <w:bCs/>
+          <w:sz w:val="22"/>
+        </w:rPr>
+      </w:pPr>
+    </w:p>
+    <w:p>
+      <w:pPr>
+        <w:spacing w:after="102"/>
+        <w:ind w:right="2"/>
+        <w:rPr>
+          <w:bCs/>
+          <w:sz w:val="22"/>
+        </w:rPr>
+      </w:pPr>
+    </w:p>
+    <w:p>
+      <w:pPr>
+        <w:spacing w:after="102"/>
+        <w:ind w:right="2"/>
+        <w:rPr>
+          <w:bCs/>
+          <w:sz w:val="22"/>
+        </w:rPr>
+      </w:pPr>
+    </w:p>
+    <w:p>
+      <w:pPr>
+        <w:spacing w:after="102"/>
+        <w:ind w:right="2"/>
+        <w:rPr>
+          <w:bCs/>
+          <w:sz w:val="22"/>
+        </w:rPr>
+      </w:pPr>
+    </w:p>
+    <w:p>
+      <w:pPr>
+        <w:spacing w:after="102"/>
+        <w:ind w:right="2"/>
+        <w:rPr>
+          <w:bCs/>
+          <w:sz w:val="22"/>
+        </w:rPr>
+      </w:pPr>
+    </w:p>
+    <w:p>
+      <w:pPr>
+        <w:spacing w:after="102"/>
+        <w:ind w:right="2"/>
+        <w:rPr>
+          <w:bCs/>
+          <w:sz w:val="22"/>
+        </w:rPr>
+      </w:pPr>
+    </w:p>
+    <w:p>
+      <w:pPr>
+        <w:spacing w:after="102"/>
+        <w:ind w:right="2"/>
+        <w:rPr>
+          <w:bCs/>
+          <w:sz w:val="22"/>
+        </w:rPr>
+      </w:pPr>
+    </w:p>
+    <w:p>
+      <w:pPr>
+        <w:spacing w:after="102"/>
+        <w:ind w:right="2"/>
+        <w:rPr>
+          <w:bCs/>
+          <w:sz w:val="22"/>
+        </w:rPr>
+      </w:pPr>
+    </w:p>
+    <w:p>
+      <w:pPr>
+        <w:spacing w:after="102"/>
+        <w:ind w:right="2"/>
+        <w:rPr>
+          <w:bCs/>
+          <w:sz w:val="22"/>
+        </w:rPr>
+      </w:pPr>
+    </w:p>
+    <w:p>
+      <w:pPr>
+        <w:spacing w:after="102"/>
+        <w:ind w:right="2"/>
+        <w:rPr>
+          <w:bCs/>
+          <w:sz w:val="22"/>
+        </w:rPr>
+      </w:pPr>
+    </w:p>
+    <w:p>
+      <w:pPr>
+        <w:spacing w:after="102"/>
+        <w:ind w:right="2"/>
+        <w:rPr>
+          <w:bCs/>
+          <w:sz w:val="22"/>
+        </w:rPr>
+      </w:pPr>
+    </w:p>
+    <w:p>
+      <w:pPr>
+        <w:spacing w:after="102"/>
+        <w:ind w:right="2"/>
+        <w:rPr>
+          <w:bCs/>
+          <w:sz w:val="22"/>
+        </w:rPr>
+      </w:pPr>
+    </w:p>
+    <w:p>
+      <w:pPr>
+        <w:spacing w:after="102"/>
+        <w:ind w:right="2"/>
+        <w:rPr>
+          <w:bCs/>
+          <w:sz w:val="22"/>
+        </w:rPr>
+      </w:pPr>
+    </w:p>
+    <w:p>
+      <w:pPr>
+        <w:spacing w:after="102"/>
+        <w:ind w:right="2"/>
+        <w:rPr>
+          <w:bCs/>
+          <w:sz w:val="22"/>
+        </w:rPr>
+      </w:pPr>
+    </w:p>
+    <w:p>
+      <w:pPr>
+        <w:spacing w:after="102"/>
+        <w:ind w:right="2"/>
+        <w:rPr>
+          <w:b/>
+          <w:sz w:val="22"/>
+        </w:rPr>
+      </w:pPr>
+      <w:r>
+        <w:rPr>
+          <w:b/>
+          <w:sz w:val="22"/>
+        </w:rPr>
+        <w:lastRenderedPageBreak/>
+        <w:t>INSPECT &amp; Compare</w:t>
+      </w:r>
+    </w:p>
+    <w:tbl>
+      <w:tblPr>
+        <w:tblStyle w:val="TableGrid0"/>
+        <w:tblW w:w="0" w:type="auto"/>
+        <w:tblInd w:w="29" w:type="dxa"/>
+        <w:shd w:val="pct5" w:color="auto" w:fill="auto"/>
+        <w:tblLook w:val="04A0" w:firstRow="1" w:lastRow="0" w:firstColumn="1" w:lastColumn="0" w:noHBand="0" w:noVBand="1"/>
+      </w:tblPr>
+      <w:tblGrid>
+        <w:gridCol w:w="3318"/>
+        <w:gridCol w:w="4586"/>
+        <w:gridCol w:w="5529"/>
+      </w:tblGrid>
+      <w:tr>
+        <w:tc>
+          <w:tcPr>
+            <w:tcW w:w="3318" w:type="dxa"/>
+            <w:shd w:val="pct5" w:color="auto" w:fill="auto"/>
+            <w:vAlign w:val="center"/>
+          </w:tcPr>
+          <w:p>
+            <w:pPr>
+              <w:spacing w:after="102"/>
+              <w:ind w:left="0" w:right="2" w:firstLine="0"/>
+              <w:jc w:val="center"/>
+              <w:rPr>
+                <w:b/>
+                <w:sz w:val="22"/>
+              </w:rPr>
+            </w:pPr>
+            <w:r>
+              <w:rPr>
+                <w:b/>
+                <w:sz w:val="22"/>
+              </w:rPr>
+              <w:t>Command</w:t>
+            </w:r>
+          </w:p>
+        </w:tc>
+        <w:tc>
+          <w:tcPr>
+            <w:tcW w:w="4586" w:type="dxa"/>
+            <w:vAlign w:val="center"/>
+          </w:tcPr>
+          <w:p>
+            <w:pPr>
+              <w:spacing w:after="102"/>
+              <w:ind w:left="0" w:right="2" w:firstLine="0"/>
+              <w:jc w:val="center"/>
+              <w:rPr>
+                <w:b/>
+                <w:sz w:val="22"/>
+              </w:rPr>
+            </w:pPr>
+            <w:r>
+              <w:rPr>
+                <w:b/>
+                <w:sz w:val="22"/>
+              </w:rPr>
+              <w:t>Sample</w:t>
+            </w:r>
+          </w:p>
+        </w:tc>
+        <w:tc>
+          <w:tcPr>
+            <w:tcW w:w="5529" w:type="dxa"/>
+            <w:vAlign w:val="center"/>
+          </w:tcPr>
+          <w:p>
+            <w:pPr>
+              <w:spacing w:after="102"/>
+              <w:ind w:left="0" w:right="2" w:firstLine="0"/>
+              <w:jc w:val="center"/>
+              <w:rPr>
+                <w:b/>
+                <w:sz w:val="22"/>
+              </w:rPr>
+            </w:pPr>
+            <w:r>
+              <w:rPr>
+                <w:b/>
+                <w:sz w:val="22"/>
+              </w:rPr>
+              <w:t>Description</w:t>
+            </w:r>
+          </w:p>
+        </w:tc>
+      </w:tr>
+      <w:tr>
+        <w:tc>
+          <w:tcPr>
+            <w:tcW w:w="3318" w:type="dxa"/>
+            <w:shd w:val="pct5" w:color="auto" w:fill="auto"/>
+            <w:vAlign w:val="center"/>
+          </w:tcPr>
+          <w:p>
+            <w:pPr>
+              <w:spacing w:after="102"/>
+              <w:ind w:left="0" w:right="2" w:firstLine="0"/>
+              <w:rPr>
+                <w:b/>
+                <w:sz w:val="22"/>
+              </w:rPr>
+            </w:pPr>
+            <w:r>
+              <w:rPr>
+                <w:b/>
+                <w:sz w:val="22"/>
+              </w:rPr>
+              <w:t>git log</w:t>
+            </w:r>
+          </w:p>
+        </w:tc>
+        <w:tc>
+          <w:tcPr>
+            <w:tcW w:w="4586" w:type="dxa"/>
+            <w:vAlign w:val="center"/>
+          </w:tcPr>
+          <w:p>
+            <w:pPr>
+              <w:spacing w:after="102"/>
+              <w:ind w:left="0" w:right="2" w:firstLine="0"/>
+              <w:rPr>
+                <w:bCs/>
+                <w:sz w:val="22"/>
+              </w:rPr>
+            </w:pPr>
+          </w:p>
+        </w:tc>
+        <w:tc>
+          <w:tcPr>
+            <w:tcW w:w="5529" w:type="dxa"/>
+            <w:vAlign w:val="center"/>
+          </w:tcPr>
+          <w:p>
+            <w:pPr>
+              <w:spacing w:after="102"/>
+              <w:ind w:left="0" w:right="2" w:firstLine="0"/>
+              <w:rPr>
+                <w:bCs/>
+                <w:sz w:val="22"/>
+              </w:rPr>
+            </w:pPr>
+            <w:r>
+              <w:rPr>
+                <w:bCs/>
+                <w:sz w:val="22"/>
+              </w:rPr>
+              <w:t>Show commit history for current active branch</w:t>
+            </w:r>
+          </w:p>
+        </w:tc>
+      </w:tr>
+      <w:tr>
+        <w:tc>
+          <w:tcPr>
+            <w:tcW w:w="3318" w:type="dxa"/>
+            <w:shd w:val="pct5" w:color="auto" w:fill="auto"/>
+            <w:vAlign w:val="center"/>
+          </w:tcPr>
+          <w:p>
+            <w:pPr>
+              <w:spacing w:after="102"/>
+              <w:ind w:left="0" w:right="2" w:firstLine="0"/>
+              <w:rPr>
+                <w:b/>
+                <w:sz w:val="22"/>
+              </w:rPr>
+            </w:pPr>
+            <w:r>
+              <w:rPr>
+                <w:b/>
+                <w:sz w:val="22"/>
+              </w:rPr>
+              <w:t>git log branchB...branchA</w:t>
+            </w:r>
+          </w:p>
+        </w:tc>
+        <w:tc>
+          <w:tcPr>
+            <w:tcW w:w="4586" w:type="dxa"/>
+            <w:vAlign w:val="center"/>
+          </w:tcPr>
+          <w:p>
+            <w:pPr>
+              <w:spacing w:after="102"/>
+              <w:ind w:left="0" w:right="2" w:firstLine="0"/>
+              <w:rPr>
+                <w:bCs/>
+                <w:sz w:val="22"/>
+              </w:rPr>
+            </w:pPr>
+          </w:p>
+        </w:tc>
+        <w:tc>
+          <w:tcPr>
+            <w:tcW w:w="5529" w:type="dxa"/>
+            <w:vAlign w:val="center"/>
+          </w:tcPr>
+          <w:p>
+            <w:pPr>
+              <w:spacing w:after="102"/>
+              <w:ind w:left="0" w:right="2" w:firstLine="0"/>
+              <w:rPr>
+                <w:bCs/>
+                <w:sz w:val="22"/>
+              </w:rPr>
+            </w:pPr>
+            <w:r>
+              <w:rPr>
+                <w:bCs/>
+                <w:sz w:val="22"/>
+              </w:rPr>
+              <w:t>Show commits in branch A not in branch B</w:t>
+            </w:r>
+          </w:p>
+        </w:tc>
+      </w:tr>
+    </w:tbl>
+    <w:p>
+      <w:pPr>
+        <w:spacing w:after="102"/>
+        <w:ind w:right="2"/>
+        <w:rPr>
+          <w:bCs/>
+          <w:sz w:val="22"/>
+        </w:rPr>
+      </w:pPr>
+    </w:p>
+    <w:p>
+      <w:pPr>
+        <w:spacing w:after="102"/>
+        <w:ind w:right="2"/>
+        <w:rPr>
+          <w:bCs/>
+          <w:sz w:val="22"/>
+        </w:rPr>
+      </w:pPr>
+    </w:p>
     <w:sectPr>
       <w:headerReference w:type="even" r:id="rId18"/>
       <w:headerReference w:type="default" r:id="rId19"/>
       <w:footerReference w:type="default" r:id="rId20"/>
       <w:headerReference w:type="first" r:id="rId21"/>
-      <w:pgSz w:w="11906" w:h="16838"/>
-      <w:pgMar w:top="720" w:right="836" w:bottom="1511" w:left="1080" w:header="432" w:footer="442" w:gutter="0"/>
+      <w:pgSz w:w="16838" w:h="11906" w:orient="landscape"/>
+      <w:pgMar w:top="1080" w:right="720" w:bottom="836" w:left="1511" w:header="432" w:footer="442" w:gutter="0"/>
       <w:cols w:space="720"/>
       <w:docGrid w:linePitch="326"/>
     </w:sectPr>
@@ -7546,6 +8553,7 @@
   <w:style w:type="character" w:default="1" w:styleId="DefaultParagraphFont">
     <w:name w:val="Default Paragraph Font"/>
     <w:uiPriority w:val="1"/>
+    <w:semiHidden/>
     <w:unhideWhenUsed/>
   </w:style>
   <w:style w:type="table" w:default="1" w:styleId="TableNormal">
@@ -7940,6 +8948,25 @@
       <w:color w:val="605E5C"/>
       <w:shd w:val="clear" w:color="auto" w:fill="E1DFDD"/>
     </w:rPr>
+  </w:style>
+  <w:style w:type="table" w:styleId="TableGrid0">
+    <w:name w:val="Table Grid"/>
+    <w:basedOn w:val="TableNormal"/>
+    <w:uiPriority w:val="39"/>
+    <w:rsid w:val="00374C96"/>
+    <w:pPr>
+      <w:spacing w:after="0" w:line="240" w:lineRule="auto"/>
+    </w:pPr>
+    <w:tblPr>
+      <w:tblBorders>
+        <w:top w:val="single" w:sz="4" w:space="0" w:color="auto"/>
+        <w:left w:val="single" w:sz="4" w:space="0" w:color="auto"/>
+        <w:bottom w:val="single" w:sz="4" w:space="0" w:color="auto"/>
+        <w:right w:val="single" w:sz="4" w:space="0" w:color="auto"/>
+        <w:insideH w:val="single" w:sz="4" w:space="0" w:color="auto"/>
+        <w:insideV w:val="single" w:sz="4" w:space="0" w:color="auto"/>
+      </w:tblBorders>
+    </w:tblPr>
   </w:style>
 </w:styles>
 </file>

</xml_diff>